<commit_message>
feat: redesign 3-column control panel with collapsible accordions and fix asset routing
</commit_message>
<xml_diff>
--- a/Alpha.bet 2026 prompt.docx
+++ b/Alpha.bet 2026 prompt.docx
@@ -2603,16 +2603,29 @@
           <w14:ligatures w14:val="none"/>
         </w:rPr>
       </w:pPr>
-      <w:r>
-        <w:rPr>
-          <w:rFonts w:ascii="Times New Roman" w:eastAsia="Times New Roman" w:hAnsi="Times New Roman" w:cs="Times New Roman"/>
-          <w:kern w:val="0"/>
-          <w:sz w:val="24"/>
-          <w:szCs w:val="24"/>
-          <w:lang w:eastAsia="en-IN"/>
-          <w14:ligatures w14:val="none"/>
-        </w:rPr>
-        <w:t>then:</w:t>
+      <w:proofErr w:type="gramStart"/>
+      <w:r>
+        <w:rPr>
+          <w:rFonts w:ascii="Times New Roman" w:eastAsia="Times New Roman" w:hAnsi="Times New Roman" w:cs="Times New Roman"/>
+          <w:kern w:val="0"/>
+          <w:sz w:val="24"/>
+          <w:szCs w:val="24"/>
+          <w:lang w:eastAsia="en-IN"/>
+          <w14:ligatures w14:val="none"/>
+        </w:rPr>
+        <w:t>then</w:t>
+      </w:r>
+      <w:proofErr w:type="gramEnd"/>
+      <w:r>
+        <w:rPr>
+          <w:rFonts w:ascii="Times New Roman" w:eastAsia="Times New Roman" w:hAnsi="Times New Roman" w:cs="Times New Roman"/>
+          <w:kern w:val="0"/>
+          <w:sz w:val="24"/>
+          <w:szCs w:val="24"/>
+          <w:lang w:eastAsia="en-IN"/>
+          <w14:ligatures w14:val="none"/>
+        </w:rPr>
+        <w:t>:</w:t>
       </w:r>
     </w:p>
     <w:p>
@@ -2669,16 +2682,29 @@
           <w14:ligatures w14:val="none"/>
         </w:rPr>
       </w:pPr>
-      <w:r>
-        <w:rPr>
-          <w:rFonts w:ascii="Times New Roman" w:eastAsia="Times New Roman" w:hAnsi="Times New Roman" w:cs="Times New Roman"/>
-          <w:kern w:val="0"/>
-          <w:sz w:val="24"/>
-          <w:szCs w:val="24"/>
-          <w:lang w:eastAsia="en-IN"/>
-          <w14:ligatures w14:val="none"/>
-        </w:rPr>
-        <w:t>must remain connected.</w:t>
+      <w:proofErr w:type="gramStart"/>
+      <w:r>
+        <w:rPr>
+          <w:rFonts w:ascii="Times New Roman" w:eastAsia="Times New Roman" w:hAnsi="Times New Roman" w:cs="Times New Roman"/>
+          <w:kern w:val="0"/>
+          <w:sz w:val="24"/>
+          <w:szCs w:val="24"/>
+          <w:lang w:eastAsia="en-IN"/>
+          <w14:ligatures w14:val="none"/>
+        </w:rPr>
+        <w:t>must</w:t>
+      </w:r>
+      <w:proofErr w:type="gramEnd"/>
+      <w:r>
+        <w:rPr>
+          <w:rFonts w:ascii="Times New Roman" w:eastAsia="Times New Roman" w:hAnsi="Times New Roman" w:cs="Times New Roman"/>
+          <w:kern w:val="0"/>
+          <w:sz w:val="24"/>
+          <w:szCs w:val="24"/>
+          <w:lang w:eastAsia="en-IN"/>
+          <w14:ligatures w14:val="none"/>
+        </w:rPr>
+        <w:t xml:space="preserve"> remain connected.</w:t>
       </w:r>
     </w:p>
     <w:p>
@@ -6260,6 +6286,7 @@
           <w14:ligatures w14:val="none"/>
         </w:rPr>
       </w:pPr>
+      <w:proofErr w:type="gramStart"/>
       <w:r>
         <w:rPr>
           <w:rFonts w:ascii="Courier New" w:eastAsia="Times New Roman" w:hAnsi="Courier New" w:cs="Courier New"/>
@@ -6271,6 +6298,7 @@
         </w:rPr>
         <w:t>beautiful</w:t>
       </w:r>
+      <w:proofErr w:type="gramEnd"/>
     </w:p>
     <w:p>
       <w:pPr>
@@ -6326,6 +6354,7 @@
           <w14:ligatures w14:val="none"/>
         </w:rPr>
       </w:pPr>
+      <w:proofErr w:type="gramStart"/>
       <w:r>
         <w:rPr>
           <w:rFonts w:ascii="Courier New" w:eastAsia="Times New Roman" w:hAnsi="Courier New" w:cs="Courier New"/>
@@ -6337,6 +6366,7 @@
         </w:rPr>
         <w:t>beautiful</w:t>
       </w:r>
+      <w:proofErr w:type="gramEnd"/>
     </w:p>
     <w:p>
       <w:pPr>
@@ -6459,6 +6489,7 @@
         </w:rPr>
       </w:pPr>
       <w:proofErr w:type="spellStart"/>
+      <w:proofErr w:type="gramStart"/>
       <w:r>
         <w:rPr>
           <w:rFonts w:ascii="Courier New" w:eastAsia="Times New Roman" w:hAnsi="Courier New" w:cs="Courier New"/>
@@ -6471,6 +6502,7 @@
         <w:t>beautifull</w:t>
       </w:r>
       <w:proofErr w:type="spellEnd"/>
+      <w:proofErr w:type="gramEnd"/>
     </w:p>
     <w:p>
       <w:pPr>
@@ -7991,16 +8023,29 @@
           <w14:ligatures w14:val="none"/>
         </w:rPr>
       </w:pPr>
-      <w:r>
-        <w:rPr>
-          <w:rFonts w:ascii="Courier New" w:eastAsia="Times New Roman" w:hAnsi="Courier New" w:cs="Courier New"/>
-          <w:kern w:val="0"/>
-          <w:sz w:val="20"/>
-          <w:szCs w:val="20"/>
-          <w:lang w:eastAsia="en-IN"/>
-          <w14:ligatures w14:val="none"/>
-        </w:rPr>
-        <w:t>01  02  03  04  05</w:t>
+      <w:proofErr w:type="gramStart"/>
+      <w:r>
+        <w:rPr>
+          <w:rFonts w:ascii="Courier New" w:eastAsia="Times New Roman" w:hAnsi="Courier New" w:cs="Courier New"/>
+          <w:kern w:val="0"/>
+          <w:sz w:val="20"/>
+          <w:szCs w:val="20"/>
+          <w:lang w:eastAsia="en-IN"/>
+          <w14:ligatures w14:val="none"/>
+        </w:rPr>
+        <w:t>01  02</w:t>
+      </w:r>
+      <w:proofErr w:type="gramEnd"/>
+      <w:r>
+        <w:rPr>
+          <w:rFonts w:ascii="Courier New" w:eastAsia="Times New Roman" w:hAnsi="Courier New" w:cs="Courier New"/>
+          <w:kern w:val="0"/>
+          <w:sz w:val="20"/>
+          <w:szCs w:val="20"/>
+          <w:lang w:eastAsia="en-IN"/>
+          <w14:ligatures w14:val="none"/>
+        </w:rPr>
+        <w:t xml:space="preserve">  03  04  05</w:t>
       </w:r>
     </w:p>
     <w:p>
@@ -8033,16 +8078,29 @@
           <w14:ligatures w14:val="none"/>
         </w:rPr>
       </w:pPr>
-      <w:r>
-        <w:rPr>
-          <w:rFonts w:ascii="Courier New" w:eastAsia="Times New Roman" w:hAnsi="Courier New" w:cs="Courier New"/>
-          <w:kern w:val="0"/>
-          <w:sz w:val="20"/>
-          <w:szCs w:val="20"/>
-          <w:lang w:eastAsia="en-IN"/>
-          <w14:ligatures w14:val="none"/>
-        </w:rPr>
-        <w:t>06  07  08  09  10</w:t>
+      <w:proofErr w:type="gramStart"/>
+      <w:r>
+        <w:rPr>
+          <w:rFonts w:ascii="Courier New" w:eastAsia="Times New Roman" w:hAnsi="Courier New" w:cs="Courier New"/>
+          <w:kern w:val="0"/>
+          <w:sz w:val="20"/>
+          <w:szCs w:val="20"/>
+          <w:lang w:eastAsia="en-IN"/>
+          <w14:ligatures w14:val="none"/>
+        </w:rPr>
+        <w:t>06  07</w:t>
+      </w:r>
+      <w:proofErr w:type="gramEnd"/>
+      <w:r>
+        <w:rPr>
+          <w:rFonts w:ascii="Courier New" w:eastAsia="Times New Roman" w:hAnsi="Courier New" w:cs="Courier New"/>
+          <w:kern w:val="0"/>
+          <w:sz w:val="20"/>
+          <w:szCs w:val="20"/>
+          <w:lang w:eastAsia="en-IN"/>
+          <w14:ligatures w14:val="none"/>
+        </w:rPr>
+        <w:t xml:space="preserve">  08  09  10</w:t>
       </w:r>
     </w:p>
     <w:p>
@@ -8075,16 +8133,29 @@
           <w14:ligatures w14:val="none"/>
         </w:rPr>
       </w:pPr>
-      <w:r>
-        <w:rPr>
-          <w:rFonts w:ascii="Courier New" w:eastAsia="Times New Roman" w:hAnsi="Courier New" w:cs="Courier New"/>
-          <w:kern w:val="0"/>
-          <w:sz w:val="20"/>
-          <w:szCs w:val="20"/>
-          <w:lang w:eastAsia="en-IN"/>
-          <w14:ligatures w14:val="none"/>
-        </w:rPr>
-        <w:t>11  12  13  14  15</w:t>
+      <w:proofErr w:type="gramStart"/>
+      <w:r>
+        <w:rPr>
+          <w:rFonts w:ascii="Courier New" w:eastAsia="Times New Roman" w:hAnsi="Courier New" w:cs="Courier New"/>
+          <w:kern w:val="0"/>
+          <w:sz w:val="20"/>
+          <w:szCs w:val="20"/>
+          <w:lang w:eastAsia="en-IN"/>
+          <w14:ligatures w14:val="none"/>
+        </w:rPr>
+        <w:t>11  12</w:t>
+      </w:r>
+      <w:proofErr w:type="gramEnd"/>
+      <w:r>
+        <w:rPr>
+          <w:rFonts w:ascii="Courier New" w:eastAsia="Times New Roman" w:hAnsi="Courier New" w:cs="Courier New"/>
+          <w:kern w:val="0"/>
+          <w:sz w:val="20"/>
+          <w:szCs w:val="20"/>
+          <w:lang w:eastAsia="en-IN"/>
+          <w14:ligatures w14:val="none"/>
+        </w:rPr>
+        <w:t xml:space="preserve">  13  14  15</w:t>
       </w:r>
     </w:p>
     <w:p>
@@ -8117,16 +8188,29 @@
           <w14:ligatures w14:val="none"/>
         </w:rPr>
       </w:pPr>
-      <w:r>
-        <w:rPr>
-          <w:rFonts w:ascii="Courier New" w:eastAsia="Times New Roman" w:hAnsi="Courier New" w:cs="Courier New"/>
-          <w:kern w:val="0"/>
-          <w:sz w:val="20"/>
-          <w:szCs w:val="20"/>
-          <w:lang w:eastAsia="en-IN"/>
-          <w14:ligatures w14:val="none"/>
-        </w:rPr>
-        <w:t>16  17  18  19  20</w:t>
+      <w:proofErr w:type="gramStart"/>
+      <w:r>
+        <w:rPr>
+          <w:rFonts w:ascii="Courier New" w:eastAsia="Times New Roman" w:hAnsi="Courier New" w:cs="Courier New"/>
+          <w:kern w:val="0"/>
+          <w:sz w:val="20"/>
+          <w:szCs w:val="20"/>
+          <w:lang w:eastAsia="en-IN"/>
+          <w14:ligatures w14:val="none"/>
+        </w:rPr>
+        <w:t>16  17</w:t>
+      </w:r>
+      <w:proofErr w:type="gramEnd"/>
+      <w:r>
+        <w:rPr>
+          <w:rFonts w:ascii="Courier New" w:eastAsia="Times New Roman" w:hAnsi="Courier New" w:cs="Courier New"/>
+          <w:kern w:val="0"/>
+          <w:sz w:val="20"/>
+          <w:szCs w:val="20"/>
+          <w:lang w:eastAsia="en-IN"/>
+          <w14:ligatures w14:val="none"/>
+        </w:rPr>
+        <w:t xml:space="preserve">  18  19  20</w:t>
       </w:r>
     </w:p>
     <w:p>
@@ -9405,6 +9489,7 @@
           <w14:ligatures w14:val="none"/>
         </w:rPr>
       </w:pPr>
+      <w:proofErr w:type="gramStart"/>
       <w:r>
         <w:rPr>
           <w:rFonts w:ascii="Courier New" w:eastAsia="Times New Roman" w:hAnsi="Courier New" w:cs="Courier New"/>
@@ -9416,6 +9501,7 @@
         </w:rPr>
         <w:t>beautiful</w:t>
       </w:r>
+      <w:proofErr w:type="gramEnd"/>
     </w:p>
     <w:p>
       <w:pPr>
@@ -9593,6 +9679,7 @@
           <w14:ligatures w14:val="none"/>
         </w:rPr>
       </w:pPr>
+      <w:proofErr w:type="gramStart"/>
       <w:r>
         <w:rPr>
           <w:rFonts w:ascii="Courier New" w:eastAsia="Times New Roman" w:hAnsi="Courier New" w:cs="Courier New"/>
@@ -9615,6 +9702,7 @@
         </w:rPr>
         <w:t>▶</w:t>
       </w:r>
+      <w:proofErr w:type="gramEnd"/>
       <w:r>
         <w:rPr>
           <w:rFonts w:ascii="Courier New" w:eastAsia="Times New Roman" w:hAnsi="Courier New" w:cs="Courier New"/>
@@ -9657,6 +9745,7 @@
           <w14:ligatures w14:val="none"/>
         </w:rPr>
       </w:pPr>
+      <w:proofErr w:type="gramStart"/>
       <w:r>
         <w:rPr>
           <w:rFonts w:ascii="Courier New" w:eastAsia="Times New Roman" w:hAnsi="Courier New" w:cs="Courier New"/>
@@ -9679,6 +9768,7 @@
         </w:rPr>
         <w:t>▶</w:t>
       </w:r>
+      <w:proofErr w:type="gramEnd"/>
       <w:r>
         <w:rPr>
           <w:rFonts w:ascii="Courier New" w:eastAsia="Times New Roman" w:hAnsi="Courier New" w:cs="Courier New"/>
@@ -9794,6 +9884,7 @@
           <w14:ligatures w14:val="none"/>
         </w:rPr>
       </w:pPr>
+      <w:proofErr w:type="gramStart"/>
       <w:r>
         <w:rPr>
           <w:rFonts w:ascii="Courier New" w:eastAsia="Times New Roman" w:hAnsi="Courier New" w:cs="Courier New"/>
@@ -9805,6 +9896,7 @@
         </w:rPr>
         <w:t>beautiful</w:t>
       </w:r>
+      <w:proofErr w:type="gramEnd"/>
     </w:p>
     <w:p>
       <w:pPr>
@@ -9993,16 +10085,29 @@
           <w14:ligatures w14:val="none"/>
         </w:rPr>
       </w:pPr>
-      <w:r>
-        <w:rPr>
-          <w:rFonts w:ascii="Courier New" w:eastAsia="Times New Roman" w:hAnsi="Courier New" w:cs="Courier New"/>
-          <w:kern w:val="0"/>
-          <w:sz w:val="20"/>
-          <w:szCs w:val="20"/>
-          <w:lang w:eastAsia="en-IN"/>
-          <w14:ligatures w14:val="none"/>
-        </w:rPr>
-        <w:t>[ ACCEPT ]</w:t>
+      <w:proofErr w:type="gramStart"/>
+      <w:r>
+        <w:rPr>
+          <w:rFonts w:ascii="Courier New" w:eastAsia="Times New Roman" w:hAnsi="Courier New" w:cs="Courier New"/>
+          <w:kern w:val="0"/>
+          <w:sz w:val="20"/>
+          <w:szCs w:val="20"/>
+          <w:lang w:eastAsia="en-IN"/>
+          <w14:ligatures w14:val="none"/>
+        </w:rPr>
+        <w:t>[ ACCEPT</w:t>
+      </w:r>
+      <w:proofErr w:type="gramEnd"/>
+      <w:r>
+        <w:rPr>
+          <w:rFonts w:ascii="Courier New" w:eastAsia="Times New Roman" w:hAnsi="Courier New" w:cs="Courier New"/>
+          <w:kern w:val="0"/>
+          <w:sz w:val="20"/>
+          <w:szCs w:val="20"/>
+          <w:lang w:eastAsia="en-IN"/>
+          <w14:ligatures w14:val="none"/>
+        </w:rPr>
+        <w:t xml:space="preserve"> ]</w:t>
       </w:r>
     </w:p>
     <w:p>
@@ -10035,16 +10140,29 @@
           <w14:ligatures w14:val="none"/>
         </w:rPr>
       </w:pPr>
-      <w:r>
-        <w:rPr>
-          <w:rFonts w:ascii="Courier New" w:eastAsia="Times New Roman" w:hAnsi="Courier New" w:cs="Courier New"/>
-          <w:kern w:val="0"/>
-          <w:sz w:val="20"/>
-          <w:szCs w:val="20"/>
-          <w:lang w:eastAsia="en-IN"/>
-          <w14:ligatures w14:val="none"/>
-        </w:rPr>
-        <w:t>[ OVERRIDE ]</w:t>
+      <w:proofErr w:type="gramStart"/>
+      <w:r>
+        <w:rPr>
+          <w:rFonts w:ascii="Courier New" w:eastAsia="Times New Roman" w:hAnsi="Courier New" w:cs="Courier New"/>
+          <w:kern w:val="0"/>
+          <w:sz w:val="20"/>
+          <w:szCs w:val="20"/>
+          <w:lang w:eastAsia="en-IN"/>
+          <w14:ligatures w14:val="none"/>
+        </w:rPr>
+        <w:t>[ OVERRIDE</w:t>
+      </w:r>
+      <w:proofErr w:type="gramEnd"/>
+      <w:r>
+        <w:rPr>
+          <w:rFonts w:ascii="Courier New" w:eastAsia="Times New Roman" w:hAnsi="Courier New" w:cs="Courier New"/>
+          <w:kern w:val="0"/>
+          <w:sz w:val="20"/>
+          <w:szCs w:val="20"/>
+          <w:lang w:eastAsia="en-IN"/>
+          <w14:ligatures w14:val="none"/>
+        </w:rPr>
+        <w:t xml:space="preserve"> ]</w:t>
       </w:r>
     </w:p>
     <w:p>
@@ -11768,16 +11886,29 @@
           <w14:ligatures w14:val="none"/>
         </w:rPr>
       </w:pPr>
-      <w:r>
-        <w:rPr>
-          <w:rFonts w:ascii="Courier New" w:eastAsia="Times New Roman" w:hAnsi="Courier New" w:cs="Courier New"/>
-          <w:kern w:val="0"/>
-          <w:sz w:val="20"/>
-          <w:szCs w:val="20"/>
-          <w:lang w:eastAsia="en-IN"/>
-          <w14:ligatures w14:val="none"/>
-        </w:rPr>
-        <w:t>[ ACCEPT WRONG ]</w:t>
+      <w:proofErr w:type="gramStart"/>
+      <w:r>
+        <w:rPr>
+          <w:rFonts w:ascii="Courier New" w:eastAsia="Times New Roman" w:hAnsi="Courier New" w:cs="Courier New"/>
+          <w:kern w:val="0"/>
+          <w:sz w:val="20"/>
+          <w:szCs w:val="20"/>
+          <w:lang w:eastAsia="en-IN"/>
+          <w14:ligatures w14:val="none"/>
+        </w:rPr>
+        <w:t>[ ACCEPT</w:t>
+      </w:r>
+      <w:proofErr w:type="gramEnd"/>
+      <w:r>
+        <w:rPr>
+          <w:rFonts w:ascii="Courier New" w:eastAsia="Times New Roman" w:hAnsi="Courier New" w:cs="Courier New"/>
+          <w:kern w:val="0"/>
+          <w:sz w:val="20"/>
+          <w:szCs w:val="20"/>
+          <w:lang w:eastAsia="en-IN"/>
+          <w14:ligatures w14:val="none"/>
+        </w:rPr>
+        <w:t xml:space="preserve"> WRONG ]</w:t>
       </w:r>
     </w:p>
     <w:p>
@@ -11810,16 +11941,29 @@
           <w14:ligatures w14:val="none"/>
         </w:rPr>
       </w:pPr>
-      <w:r>
-        <w:rPr>
-          <w:rFonts w:ascii="Courier New" w:eastAsia="Times New Roman" w:hAnsi="Courier New" w:cs="Courier New"/>
-          <w:kern w:val="0"/>
-          <w:sz w:val="20"/>
-          <w:szCs w:val="20"/>
-          <w:lang w:eastAsia="en-IN"/>
-          <w14:ligatures w14:val="none"/>
-        </w:rPr>
-        <w:t>[ OVERRIDE TO CORRECT ]</w:t>
+      <w:proofErr w:type="gramStart"/>
+      <w:r>
+        <w:rPr>
+          <w:rFonts w:ascii="Courier New" w:eastAsia="Times New Roman" w:hAnsi="Courier New" w:cs="Courier New"/>
+          <w:kern w:val="0"/>
+          <w:sz w:val="20"/>
+          <w:szCs w:val="20"/>
+          <w:lang w:eastAsia="en-IN"/>
+          <w14:ligatures w14:val="none"/>
+        </w:rPr>
+        <w:t>[ OVERRIDE</w:t>
+      </w:r>
+      <w:proofErr w:type="gramEnd"/>
+      <w:r>
+        <w:rPr>
+          <w:rFonts w:ascii="Courier New" w:eastAsia="Times New Roman" w:hAnsi="Courier New" w:cs="Courier New"/>
+          <w:kern w:val="0"/>
+          <w:sz w:val="20"/>
+          <w:szCs w:val="20"/>
+          <w:lang w:eastAsia="en-IN"/>
+          <w14:ligatures w14:val="none"/>
+        </w:rPr>
+        <w:t xml:space="preserve"> TO CORRECT ]</w:t>
       </w:r>
     </w:p>
     <w:p>
@@ -13176,16 +13320,29 @@
           <w14:ligatures w14:val="none"/>
         </w:rPr>
       </w:pPr>
-      <w:r>
-        <w:rPr>
-          <w:rFonts w:ascii="Courier New" w:eastAsia="Times New Roman" w:hAnsi="Courier New" w:cs="Courier New"/>
-          <w:kern w:val="0"/>
-          <w:sz w:val="20"/>
-          <w:szCs w:val="20"/>
-          <w:lang w:eastAsia="en-IN"/>
-          <w14:ligatures w14:val="none"/>
-        </w:rPr>
-        <w:t>[ START COMPETITION ]</w:t>
+      <w:proofErr w:type="gramStart"/>
+      <w:r>
+        <w:rPr>
+          <w:rFonts w:ascii="Courier New" w:eastAsia="Times New Roman" w:hAnsi="Courier New" w:cs="Courier New"/>
+          <w:kern w:val="0"/>
+          <w:sz w:val="20"/>
+          <w:szCs w:val="20"/>
+          <w:lang w:eastAsia="en-IN"/>
+          <w14:ligatures w14:val="none"/>
+        </w:rPr>
+        <w:t>[ START</w:t>
+      </w:r>
+      <w:proofErr w:type="gramEnd"/>
+      <w:r>
+        <w:rPr>
+          <w:rFonts w:ascii="Courier New" w:eastAsia="Times New Roman" w:hAnsi="Courier New" w:cs="Courier New"/>
+          <w:kern w:val="0"/>
+          <w:sz w:val="20"/>
+          <w:szCs w:val="20"/>
+          <w:lang w:eastAsia="en-IN"/>
+          <w14:ligatures w14:val="none"/>
+        </w:rPr>
+        <w:t xml:space="preserve"> COMPETITION ]</w:t>
       </w:r>
     </w:p>
     <w:p>
@@ -13726,16 +13883,29 @@
           <w14:ligatures w14:val="none"/>
         </w:rPr>
       </w:pPr>
-      <w:r>
-        <w:rPr>
-          <w:rFonts w:ascii="Courier New" w:eastAsia="Times New Roman" w:hAnsi="Courier New" w:cs="Courier New"/>
-          <w:kern w:val="0"/>
-          <w:sz w:val="20"/>
-          <w:szCs w:val="20"/>
-          <w:lang w:eastAsia="en-IN"/>
-          <w14:ligatures w14:val="none"/>
-        </w:rPr>
-        <w:t>[ RESUME ]</w:t>
+      <w:proofErr w:type="gramStart"/>
+      <w:r>
+        <w:rPr>
+          <w:rFonts w:ascii="Courier New" w:eastAsia="Times New Roman" w:hAnsi="Courier New" w:cs="Courier New"/>
+          <w:kern w:val="0"/>
+          <w:sz w:val="20"/>
+          <w:szCs w:val="20"/>
+          <w:lang w:eastAsia="en-IN"/>
+          <w14:ligatures w14:val="none"/>
+        </w:rPr>
+        <w:t>[ RESUME</w:t>
+      </w:r>
+      <w:proofErr w:type="gramEnd"/>
+      <w:r>
+        <w:rPr>
+          <w:rFonts w:ascii="Courier New" w:eastAsia="Times New Roman" w:hAnsi="Courier New" w:cs="Courier New"/>
+          <w:kern w:val="0"/>
+          <w:sz w:val="20"/>
+          <w:szCs w:val="20"/>
+          <w:lang w:eastAsia="en-IN"/>
+          <w14:ligatures w14:val="none"/>
+        </w:rPr>
+        <w:t xml:space="preserve"> ]</w:t>
       </w:r>
     </w:p>
     <w:p>
@@ -13768,16 +13938,29 @@
           <w14:ligatures w14:val="none"/>
         </w:rPr>
       </w:pPr>
-      <w:r>
-        <w:rPr>
-          <w:rFonts w:ascii="Courier New" w:eastAsia="Times New Roman" w:hAnsi="Courier New" w:cs="Courier New"/>
-          <w:kern w:val="0"/>
-          <w:sz w:val="20"/>
-          <w:szCs w:val="20"/>
-          <w:lang w:eastAsia="en-IN"/>
-          <w14:ligatures w14:val="none"/>
-        </w:rPr>
-        <w:t>[ START NEW ]</w:t>
+      <w:proofErr w:type="gramStart"/>
+      <w:r>
+        <w:rPr>
+          <w:rFonts w:ascii="Courier New" w:eastAsia="Times New Roman" w:hAnsi="Courier New" w:cs="Courier New"/>
+          <w:kern w:val="0"/>
+          <w:sz w:val="20"/>
+          <w:szCs w:val="20"/>
+          <w:lang w:eastAsia="en-IN"/>
+          <w14:ligatures w14:val="none"/>
+        </w:rPr>
+        <w:t>[ START</w:t>
+      </w:r>
+      <w:proofErr w:type="gramEnd"/>
+      <w:r>
+        <w:rPr>
+          <w:rFonts w:ascii="Courier New" w:eastAsia="Times New Roman" w:hAnsi="Courier New" w:cs="Courier New"/>
+          <w:kern w:val="0"/>
+          <w:sz w:val="20"/>
+          <w:szCs w:val="20"/>
+          <w:lang w:eastAsia="en-IN"/>
+          <w14:ligatures w14:val="none"/>
+        </w:rPr>
+        <w:t xml:space="preserve"> NEW ]</w:t>
       </w:r>
     </w:p>
     <w:p>
@@ -15963,16 +16146,29 @@
           <w14:ligatures w14:val="none"/>
         </w:rPr>
       </w:pPr>
-      <w:r>
-        <w:rPr>
-          <w:rFonts w:ascii="Times New Roman" w:eastAsia="Times New Roman" w:hAnsi="Times New Roman" w:cs="Times New Roman"/>
-          <w:kern w:val="0"/>
-          <w:sz w:val="24"/>
-          <w:szCs w:val="24"/>
-          <w:lang w:eastAsia="en-IN"/>
-          <w14:ligatures w14:val="none"/>
-        </w:rPr>
-        <w:t>sees the Display/OBS Panel.</w:t>
+      <w:proofErr w:type="gramStart"/>
+      <w:r>
+        <w:rPr>
+          <w:rFonts w:ascii="Times New Roman" w:eastAsia="Times New Roman" w:hAnsi="Times New Roman" w:cs="Times New Roman"/>
+          <w:kern w:val="0"/>
+          <w:sz w:val="24"/>
+          <w:szCs w:val="24"/>
+          <w:lang w:eastAsia="en-IN"/>
+          <w14:ligatures w14:val="none"/>
+        </w:rPr>
+        <w:t>sees</w:t>
+      </w:r>
+      <w:proofErr w:type="gramEnd"/>
+      <w:r>
+        <w:rPr>
+          <w:rFonts w:ascii="Times New Roman" w:eastAsia="Times New Roman" w:hAnsi="Times New Roman" w:cs="Times New Roman"/>
+          <w:kern w:val="0"/>
+          <w:sz w:val="24"/>
+          <w:szCs w:val="24"/>
+          <w:lang w:eastAsia="en-IN"/>
+          <w14:ligatures w14:val="none"/>
+        </w:rPr>
+        <w:t xml:space="preserve"> the Display/OBS Panel.</w:t>
       </w:r>
     </w:p>
     <w:p>
@@ -16983,7 +17179,7 @@
           <w14:ligatures w14:val="none"/>
         </w:rPr>
         <w:pict>
-          <v:rect id="_x0000_i1075" style="width:0;height:1.5pt" o:hralign="center" o:hrstd="t" o:hr="t" fillcolor="#a0a0a0" stroked="f"/>
+          <v:rect id="_x0000_i1050" style="width:0;height:1.5pt" o:hralign="center" o:hrstd="t" o:hr="t" fillcolor="#a0a0a0" stroked="f"/>
         </w:pict>
       </w:r>
     </w:p>
@@ -17245,6 +17441,7 @@
           <w14:ligatures w14:val="none"/>
         </w:rPr>
       </w:pPr>
+      <w:proofErr w:type="gramStart"/>
       <w:r>
         <w:rPr>
           <w:rFonts w:ascii="Courier New" w:eastAsia="Times New Roman" w:hAnsi="Courier New" w:cs="Courier New"/>
@@ -17256,6 +17453,7 @@
         </w:rPr>
         <w:t>beautiful</w:t>
       </w:r>
+      <w:proofErr w:type="gramEnd"/>
     </w:p>
     <w:p>
       <w:pPr>
@@ -17590,16 +17788,29 @@
           <w14:ligatures w14:val="none"/>
         </w:rPr>
       </w:pPr>
-      <w:r>
-        <w:rPr>
-          <w:rFonts w:ascii="Courier New" w:eastAsia="Times New Roman" w:hAnsi="Courier New" w:cs="Courier New"/>
-          <w:kern w:val="0"/>
-          <w:sz w:val="20"/>
-          <w:szCs w:val="20"/>
-          <w:lang w:eastAsia="en-IN"/>
-          <w14:ligatures w14:val="none"/>
-        </w:rPr>
-        <w:t xml:space="preserve">beautiful → beautiful.mp3 </w:t>
+      <w:proofErr w:type="gramStart"/>
+      <w:r>
+        <w:rPr>
+          <w:rFonts w:ascii="Courier New" w:eastAsia="Times New Roman" w:hAnsi="Courier New" w:cs="Courier New"/>
+          <w:kern w:val="0"/>
+          <w:sz w:val="20"/>
+          <w:szCs w:val="20"/>
+          <w:lang w:eastAsia="en-IN"/>
+          <w14:ligatures w14:val="none"/>
+        </w:rPr>
+        <w:t>beautiful</w:t>
+      </w:r>
+      <w:proofErr w:type="gramEnd"/>
+      <w:r>
+        <w:rPr>
+          <w:rFonts w:ascii="Courier New" w:eastAsia="Times New Roman" w:hAnsi="Courier New" w:cs="Courier New"/>
+          <w:kern w:val="0"/>
+          <w:sz w:val="20"/>
+          <w:szCs w:val="20"/>
+          <w:lang w:eastAsia="en-IN"/>
+          <w14:ligatures w14:val="none"/>
+        </w:rPr>
+        <w:t xml:space="preserve"> → beautiful.mp3 </w:t>
       </w:r>
       <w:r>
         <w:rPr>
@@ -17635,7 +17846,7 @@
           <w14:ligatures w14:val="none"/>
         </w:rPr>
         <w:pict>
-          <v:rect id="_x0000_i1076" style="width:0;height:1.5pt" o:hralign="center" o:hrstd="t" o:hr="t" fillcolor="#a0a0a0" stroked="f"/>
+          <v:rect id="_x0000_i1051" style="width:0;height:1.5pt" o:hralign="center" o:hrstd="t" o:hr="t" fillcolor="#a0a0a0" stroked="f"/>
         </w:pict>
       </w:r>
     </w:p>
@@ -17927,16 +18138,29 @@
           <w14:ligatures w14:val="none"/>
         </w:rPr>
       </w:pPr>
-      <w:r>
-        <w:rPr>
-          <w:rFonts w:ascii="Times New Roman" w:eastAsia="Times New Roman" w:hAnsi="Times New Roman" w:cs="Times New Roman"/>
-          <w:kern w:val="0"/>
-          <w:sz w:val="24"/>
-          <w:szCs w:val="24"/>
-          <w:lang w:eastAsia="en-IN"/>
-          <w14:ligatures w14:val="none"/>
-        </w:rPr>
-        <w:t>should match successfully.</w:t>
+      <w:proofErr w:type="gramStart"/>
+      <w:r>
+        <w:rPr>
+          <w:rFonts w:ascii="Times New Roman" w:eastAsia="Times New Roman" w:hAnsi="Times New Roman" w:cs="Times New Roman"/>
+          <w:kern w:val="0"/>
+          <w:sz w:val="24"/>
+          <w:szCs w:val="24"/>
+          <w:lang w:eastAsia="en-IN"/>
+          <w14:ligatures w14:val="none"/>
+        </w:rPr>
+        <w:t>should</w:t>
+      </w:r>
+      <w:proofErr w:type="gramEnd"/>
+      <w:r>
+        <w:rPr>
+          <w:rFonts w:ascii="Times New Roman" w:eastAsia="Times New Roman" w:hAnsi="Times New Roman" w:cs="Times New Roman"/>
+          <w:kern w:val="0"/>
+          <w:sz w:val="24"/>
+          <w:szCs w:val="24"/>
+          <w:lang w:eastAsia="en-IN"/>
+          <w14:ligatures w14:val="none"/>
+        </w:rPr>
+        <w:t xml:space="preserve"> match successfully.</w:t>
       </w:r>
     </w:p>
     <w:p>
@@ -17961,7 +18185,7 @@
           <w14:ligatures w14:val="none"/>
         </w:rPr>
         <w:pict>
-          <v:rect id="_x0000_i1077" style="width:0;height:1.5pt" o:hralign="center" o:hrstd="t" o:hr="t" fillcolor="#a0a0a0" stroked="f"/>
+          <v:rect id="_x0000_i1052" style="width:0;height:1.5pt" o:hralign="center" o:hrstd="t" o:hr="t" fillcolor="#a0a0a0" stroked="f"/>
         </w:pict>
       </w:r>
     </w:p>
@@ -18180,16 +18404,29 @@
           <w14:ligatures w14:val="none"/>
         </w:rPr>
       </w:pPr>
-      <w:r>
-        <w:rPr>
-          <w:rFonts w:ascii="Times New Roman" w:eastAsia="Times New Roman" w:hAnsi="Times New Roman" w:cs="Times New Roman"/>
-          <w:kern w:val="0"/>
-          <w:sz w:val="24"/>
-          <w:szCs w:val="24"/>
-          <w:lang w:eastAsia="en-IN"/>
-          <w14:ligatures w14:val="none"/>
-        </w:rPr>
-        <w:t>all represent the word:</w:t>
+      <w:proofErr w:type="gramStart"/>
+      <w:r>
+        <w:rPr>
+          <w:rFonts w:ascii="Times New Roman" w:eastAsia="Times New Roman" w:hAnsi="Times New Roman" w:cs="Times New Roman"/>
+          <w:kern w:val="0"/>
+          <w:sz w:val="24"/>
+          <w:szCs w:val="24"/>
+          <w:lang w:eastAsia="en-IN"/>
+          <w14:ligatures w14:val="none"/>
+        </w:rPr>
+        <w:t>all</w:t>
+      </w:r>
+      <w:proofErr w:type="gramEnd"/>
+      <w:r>
+        <w:rPr>
+          <w:rFonts w:ascii="Times New Roman" w:eastAsia="Times New Roman" w:hAnsi="Times New Roman" w:cs="Times New Roman"/>
+          <w:kern w:val="0"/>
+          <w:sz w:val="24"/>
+          <w:szCs w:val="24"/>
+          <w:lang w:eastAsia="en-IN"/>
+          <w14:ligatures w14:val="none"/>
+        </w:rPr>
+        <w:t xml:space="preserve"> represent the word:</w:t>
       </w:r>
     </w:p>
     <w:p>
@@ -18222,6 +18459,7 @@
           <w14:ligatures w14:val="none"/>
         </w:rPr>
       </w:pPr>
+      <w:proofErr w:type="gramStart"/>
       <w:r>
         <w:rPr>
           <w:rFonts w:ascii="Courier New" w:eastAsia="Times New Roman" w:hAnsi="Courier New" w:cs="Courier New"/>
@@ -18233,6 +18471,7 @@
         </w:rPr>
         <w:t>beautiful</w:t>
       </w:r>
+      <w:proofErr w:type="gramEnd"/>
     </w:p>
     <w:p>
       <w:pPr>
@@ -18256,7 +18495,7 @@
           <w14:ligatures w14:val="none"/>
         </w:rPr>
         <w:pict>
-          <v:rect id="_x0000_i1078" style="width:0;height:1.5pt" o:hralign="center" o:hrstd="t" o:hr="t" fillcolor="#a0a0a0" stroked="f"/>
+          <v:rect id="_x0000_i1053" style="width:0;height:1.5pt" o:hralign="center" o:hrstd="t" o:hr="t" fillcolor="#a0a0a0" stroked="f"/>
         </w:pict>
       </w:r>
     </w:p>
@@ -18392,16 +18631,29 @@
           <w14:ligatures w14:val="none"/>
         </w:rPr>
       </w:pPr>
-      <w:r>
-        <w:rPr>
-          <w:rFonts w:ascii="Courier New" w:eastAsia="Times New Roman" w:hAnsi="Courier New" w:cs="Courier New"/>
-          <w:kern w:val="0"/>
-          <w:sz w:val="20"/>
-          <w:szCs w:val="20"/>
-          <w:lang w:eastAsia="en-IN"/>
-          <w14:ligatures w14:val="none"/>
-        </w:rPr>
-        <w:t>ice cream</w:t>
+      <w:proofErr w:type="gramStart"/>
+      <w:r>
+        <w:rPr>
+          <w:rFonts w:ascii="Courier New" w:eastAsia="Times New Roman" w:hAnsi="Courier New" w:cs="Courier New"/>
+          <w:kern w:val="0"/>
+          <w:sz w:val="20"/>
+          <w:szCs w:val="20"/>
+          <w:lang w:eastAsia="en-IN"/>
+          <w14:ligatures w14:val="none"/>
+        </w:rPr>
+        <w:t>ice</w:t>
+      </w:r>
+      <w:proofErr w:type="gramEnd"/>
+      <w:r>
+        <w:rPr>
+          <w:rFonts w:ascii="Courier New" w:eastAsia="Times New Roman" w:hAnsi="Courier New" w:cs="Courier New"/>
+          <w:kern w:val="0"/>
+          <w:sz w:val="20"/>
+          <w:szCs w:val="20"/>
+          <w:lang w:eastAsia="en-IN"/>
+          <w14:ligatures w14:val="none"/>
+        </w:rPr>
+        <w:t xml:space="preserve"> cream</w:t>
       </w:r>
     </w:p>
     <w:p>
@@ -18458,16 +18710,29 @@
           <w14:ligatures w14:val="none"/>
         </w:rPr>
       </w:pPr>
-      <w:r>
-        <w:rPr>
-          <w:rFonts w:ascii="Courier New" w:eastAsia="Times New Roman" w:hAnsi="Courier New" w:cs="Courier New"/>
-          <w:kern w:val="0"/>
-          <w:sz w:val="20"/>
-          <w:szCs w:val="20"/>
-          <w:lang w:eastAsia="en-IN"/>
-          <w14:ligatures w14:val="none"/>
-        </w:rPr>
-        <w:t>ice cream.mp3</w:t>
+      <w:proofErr w:type="gramStart"/>
+      <w:r>
+        <w:rPr>
+          <w:rFonts w:ascii="Courier New" w:eastAsia="Times New Roman" w:hAnsi="Courier New" w:cs="Courier New"/>
+          <w:kern w:val="0"/>
+          <w:sz w:val="20"/>
+          <w:szCs w:val="20"/>
+          <w:lang w:eastAsia="en-IN"/>
+          <w14:ligatures w14:val="none"/>
+        </w:rPr>
+        <w:t>ice</w:t>
+      </w:r>
+      <w:proofErr w:type="gramEnd"/>
+      <w:r>
+        <w:rPr>
+          <w:rFonts w:ascii="Courier New" w:eastAsia="Times New Roman" w:hAnsi="Courier New" w:cs="Courier New"/>
+          <w:kern w:val="0"/>
+          <w:sz w:val="20"/>
+          <w:szCs w:val="20"/>
+          <w:lang w:eastAsia="en-IN"/>
+          <w14:ligatures w14:val="none"/>
+        </w:rPr>
+        <w:t xml:space="preserve"> cream.mp3</w:t>
       </w:r>
     </w:p>
     <w:p>
@@ -18548,6 +18813,7 @@
           <w14:ligatures w14:val="none"/>
         </w:rPr>
       </w:pPr>
+      <w:proofErr w:type="gramStart"/>
       <w:r>
         <w:rPr>
           <w:rFonts w:ascii="Times New Roman" w:eastAsia="Times New Roman" w:hAnsi="Times New Roman" w:cs="Times New Roman"/>
@@ -18559,6 +18825,7 @@
         </w:rPr>
         <w:t>and</w:t>
       </w:r>
+      <w:proofErr w:type="gramEnd"/>
     </w:p>
     <w:p>
       <w:pPr>
@@ -18590,6 +18857,7 @@
           <w14:ligatures w14:val="none"/>
         </w:rPr>
       </w:pPr>
+      <w:proofErr w:type="gramStart"/>
       <w:r>
         <w:rPr>
           <w:rFonts w:ascii="Courier New" w:eastAsia="Times New Roman" w:hAnsi="Courier New" w:cs="Courier New"/>
@@ -18601,29 +18869,43 @@
         </w:rPr>
         <w:t>ice-cream.mp3</w:t>
       </w:r>
-    </w:p>
-    <w:p>
-      <w:pPr>
-        <w:spacing w:before="100" w:beforeAutospacing="1" w:after="100" w:afterAutospacing="1" w:line="240" w:lineRule="auto"/>
-        <w:rPr>
-          <w:rFonts w:ascii="Times New Roman" w:eastAsia="Times New Roman" w:hAnsi="Times New Roman" w:cs="Times New Roman"/>
-          <w:kern w:val="0"/>
-          <w:sz w:val="24"/>
-          <w:szCs w:val="24"/>
-          <w:lang w:eastAsia="en-IN"/>
-          <w14:ligatures w14:val="none"/>
-        </w:rPr>
-      </w:pPr>
-      <w:r>
-        <w:rPr>
-          <w:rFonts w:ascii="Times New Roman" w:eastAsia="Times New Roman" w:hAnsi="Times New Roman" w:cs="Times New Roman"/>
-          <w:kern w:val="0"/>
-          <w:sz w:val="24"/>
-          <w:szCs w:val="24"/>
-          <w:lang w:eastAsia="en-IN"/>
-          <w14:ligatures w14:val="none"/>
-        </w:rPr>
-        <w:t>by normalizing spaces, underscores and hyphens during matching.</w:t>
+      <w:proofErr w:type="gramEnd"/>
+    </w:p>
+    <w:p>
+      <w:pPr>
+        <w:spacing w:before="100" w:beforeAutospacing="1" w:after="100" w:afterAutospacing="1" w:line="240" w:lineRule="auto"/>
+        <w:rPr>
+          <w:rFonts w:ascii="Times New Roman" w:eastAsia="Times New Roman" w:hAnsi="Times New Roman" w:cs="Times New Roman"/>
+          <w:kern w:val="0"/>
+          <w:sz w:val="24"/>
+          <w:szCs w:val="24"/>
+          <w:lang w:eastAsia="en-IN"/>
+          <w14:ligatures w14:val="none"/>
+        </w:rPr>
+      </w:pPr>
+      <w:proofErr w:type="gramStart"/>
+      <w:r>
+        <w:rPr>
+          <w:rFonts w:ascii="Times New Roman" w:eastAsia="Times New Roman" w:hAnsi="Times New Roman" w:cs="Times New Roman"/>
+          <w:kern w:val="0"/>
+          <w:sz w:val="24"/>
+          <w:szCs w:val="24"/>
+          <w:lang w:eastAsia="en-IN"/>
+          <w14:ligatures w14:val="none"/>
+        </w:rPr>
+        <w:t>by</w:t>
+      </w:r>
+      <w:proofErr w:type="gramEnd"/>
+      <w:r>
+        <w:rPr>
+          <w:rFonts w:ascii="Times New Roman" w:eastAsia="Times New Roman" w:hAnsi="Times New Roman" w:cs="Times New Roman"/>
+          <w:kern w:val="0"/>
+          <w:sz w:val="24"/>
+          <w:szCs w:val="24"/>
+          <w:lang w:eastAsia="en-IN"/>
+          <w14:ligatures w14:val="none"/>
+        </w:rPr>
+        <w:t xml:space="preserve"> normalizing spaces, underscores and hyphens during matching.</w:t>
       </w:r>
     </w:p>
     <w:p>
@@ -18648,7 +18930,7 @@
           <w14:ligatures w14:val="none"/>
         </w:rPr>
         <w:pict>
-          <v:rect id="_x0000_i1079" style="width:0;height:1.5pt" o:hralign="center" o:hrstd="t" o:hr="t" fillcolor="#a0a0a0" stroked="f"/>
+          <v:rect id="_x0000_i1054" style="width:0;height:1.5pt" o:hralign="center" o:hrstd="t" o:hr="t" fillcolor="#a0a0a0" stroked="f"/>
         </w:pict>
       </w:r>
     </w:p>
@@ -18801,6 +19083,7 @@
           <w14:ligatures w14:val="none"/>
         </w:rPr>
       </w:pPr>
+      <w:proofErr w:type="gramStart"/>
       <w:r>
         <w:rPr>
           <w:rFonts w:ascii="Courier New" w:eastAsia="Times New Roman" w:hAnsi="Courier New" w:cs="Courier New"/>
@@ -18812,6 +19095,7 @@
         </w:rPr>
         <w:t>children's</w:t>
       </w:r>
+      <w:proofErr w:type="gramEnd"/>
     </w:p>
     <w:p>
       <w:pPr>
@@ -18916,6 +19200,7 @@
           <w14:ligatures w14:val="none"/>
         </w:rPr>
       </w:pPr>
+      <w:proofErr w:type="gramStart"/>
       <w:r>
         <w:rPr>
           <w:rFonts w:ascii="Courier New" w:eastAsia="Times New Roman" w:hAnsi="Courier New" w:cs="Courier New"/>
@@ -18927,6 +19212,7 @@
         </w:rPr>
         <w:t>children's.mp3</w:t>
       </w:r>
+      <w:proofErr w:type="gramEnd"/>
     </w:p>
     <w:p>
       <w:pPr>
@@ -18974,7 +19260,7 @@
           <w14:ligatures w14:val="none"/>
         </w:rPr>
         <w:pict>
-          <v:rect id="_x0000_i1080" style="width:0;height:1.5pt" o:hralign="center" o:hrstd="t" o:hr="t" fillcolor="#a0a0a0" stroked="f"/>
+          <v:rect id="_x0000_i1055" style="width:0;height:1.5pt" o:hralign="center" o:hrstd="t" o:hr="t" fillcolor="#a0a0a0" stroked="f"/>
         </w:pict>
       </w:r>
     </w:p>
@@ -19706,7 +19992,7 @@
           <w14:ligatures w14:val="none"/>
         </w:rPr>
         <w:pict>
-          <v:rect id="_x0000_i1081" style="width:0;height:1.5pt" o:hralign="center" o:hrstd="t" o:hr="t" fillcolor="#a0a0a0" stroked="f"/>
+          <v:rect id="_x0000_i1056" style="width:0;height:1.5pt" o:hralign="center" o:hrstd="t" o:hr="t" fillcolor="#a0a0a0" stroked="f"/>
         </w:pict>
       </w:r>
     </w:p>
@@ -19890,16 +20176,29 @@
           <w14:ligatures w14:val="none"/>
         </w:rPr>
       </w:pPr>
-      <w:r>
-        <w:rPr>
-          <w:rFonts w:ascii="Courier New" w:eastAsia="Times New Roman" w:hAnsi="Courier New" w:cs="Courier New"/>
-          <w:kern w:val="0"/>
-          <w:sz w:val="20"/>
-          <w:szCs w:val="20"/>
-          <w:lang w:eastAsia="en-IN"/>
-          <w14:ligatures w14:val="none"/>
-        </w:rPr>
-        <w:t xml:space="preserve">01  beautiful          </w:t>
+      <w:proofErr w:type="gramStart"/>
+      <w:r>
+        <w:rPr>
+          <w:rFonts w:ascii="Courier New" w:eastAsia="Times New Roman" w:hAnsi="Courier New" w:cs="Courier New"/>
+          <w:kern w:val="0"/>
+          <w:sz w:val="20"/>
+          <w:szCs w:val="20"/>
+          <w:lang w:eastAsia="en-IN"/>
+          <w14:ligatures w14:val="none"/>
+        </w:rPr>
+        <w:t>01  beautiful</w:t>
+      </w:r>
+      <w:proofErr w:type="gramEnd"/>
+      <w:r>
+        <w:rPr>
+          <w:rFonts w:ascii="Courier New" w:eastAsia="Times New Roman" w:hAnsi="Courier New" w:cs="Courier New"/>
+          <w:kern w:val="0"/>
+          <w:sz w:val="20"/>
+          <w:szCs w:val="20"/>
+          <w:lang w:eastAsia="en-IN"/>
+          <w14:ligatures w14:val="none"/>
+        </w:rPr>
+        <w:t xml:space="preserve">          </w:t>
       </w:r>
       <w:r>
         <w:rPr>
@@ -19954,16 +20253,29 @@
           <w14:ligatures w14:val="none"/>
         </w:rPr>
       </w:pPr>
-      <w:r>
-        <w:rPr>
-          <w:rFonts w:ascii="Courier New" w:eastAsia="Times New Roman" w:hAnsi="Courier New" w:cs="Courier New"/>
-          <w:kern w:val="0"/>
-          <w:sz w:val="20"/>
-          <w:szCs w:val="20"/>
-          <w:lang w:eastAsia="en-IN"/>
-          <w14:ligatures w14:val="none"/>
-        </w:rPr>
-        <w:t xml:space="preserve">02  environment        </w:t>
+      <w:proofErr w:type="gramStart"/>
+      <w:r>
+        <w:rPr>
+          <w:rFonts w:ascii="Courier New" w:eastAsia="Times New Roman" w:hAnsi="Courier New" w:cs="Courier New"/>
+          <w:kern w:val="0"/>
+          <w:sz w:val="20"/>
+          <w:szCs w:val="20"/>
+          <w:lang w:eastAsia="en-IN"/>
+          <w14:ligatures w14:val="none"/>
+        </w:rPr>
+        <w:t>02  environment</w:t>
+      </w:r>
+      <w:proofErr w:type="gramEnd"/>
+      <w:r>
+        <w:rPr>
+          <w:rFonts w:ascii="Courier New" w:eastAsia="Times New Roman" w:hAnsi="Courier New" w:cs="Courier New"/>
+          <w:kern w:val="0"/>
+          <w:sz w:val="20"/>
+          <w:szCs w:val="20"/>
+          <w:lang w:eastAsia="en-IN"/>
+          <w14:ligatures w14:val="none"/>
+        </w:rPr>
+        <w:t xml:space="preserve">        </w:t>
       </w:r>
       <w:r>
         <w:rPr>
@@ -20018,16 +20330,29 @@
           <w14:ligatures w14:val="none"/>
         </w:rPr>
       </w:pPr>
-      <w:r>
-        <w:rPr>
-          <w:rFonts w:ascii="Courier New" w:eastAsia="Times New Roman" w:hAnsi="Courier New" w:cs="Courier New"/>
-          <w:kern w:val="0"/>
-          <w:sz w:val="20"/>
-          <w:szCs w:val="20"/>
-          <w:lang w:eastAsia="en-IN"/>
-          <w14:ligatures w14:val="none"/>
-        </w:rPr>
-        <w:t xml:space="preserve">03  magnificent        </w:t>
+      <w:proofErr w:type="gramStart"/>
+      <w:r>
+        <w:rPr>
+          <w:rFonts w:ascii="Courier New" w:eastAsia="Times New Roman" w:hAnsi="Courier New" w:cs="Courier New"/>
+          <w:kern w:val="0"/>
+          <w:sz w:val="20"/>
+          <w:szCs w:val="20"/>
+          <w:lang w:eastAsia="en-IN"/>
+          <w14:ligatures w14:val="none"/>
+        </w:rPr>
+        <w:t>03  magnificent</w:t>
+      </w:r>
+      <w:proofErr w:type="gramEnd"/>
+      <w:r>
+        <w:rPr>
+          <w:rFonts w:ascii="Courier New" w:eastAsia="Times New Roman" w:hAnsi="Courier New" w:cs="Courier New"/>
+          <w:kern w:val="0"/>
+          <w:sz w:val="20"/>
+          <w:szCs w:val="20"/>
+          <w:lang w:eastAsia="en-IN"/>
+          <w14:ligatures w14:val="none"/>
+        </w:rPr>
+        <w:t xml:space="preserve">        </w:t>
       </w:r>
       <w:r>
         <w:rPr>
@@ -20082,16 +20407,29 @@
           <w14:ligatures w14:val="none"/>
         </w:rPr>
       </w:pPr>
-      <w:r>
-        <w:rPr>
-          <w:rFonts w:ascii="Courier New" w:eastAsia="Times New Roman" w:hAnsi="Courier New" w:cs="Courier New"/>
-          <w:kern w:val="0"/>
-          <w:sz w:val="20"/>
-          <w:szCs w:val="20"/>
-          <w:lang w:eastAsia="en-IN"/>
-          <w14:ligatures w14:val="none"/>
-        </w:rPr>
-        <w:t xml:space="preserve">04  responsibility     </w:t>
+      <w:proofErr w:type="gramStart"/>
+      <w:r>
+        <w:rPr>
+          <w:rFonts w:ascii="Courier New" w:eastAsia="Times New Roman" w:hAnsi="Courier New" w:cs="Courier New"/>
+          <w:kern w:val="0"/>
+          <w:sz w:val="20"/>
+          <w:szCs w:val="20"/>
+          <w:lang w:eastAsia="en-IN"/>
+          <w14:ligatures w14:val="none"/>
+        </w:rPr>
+        <w:t>04  responsibility</w:t>
+      </w:r>
+      <w:proofErr w:type="gramEnd"/>
+      <w:r>
+        <w:rPr>
+          <w:rFonts w:ascii="Courier New" w:eastAsia="Times New Roman" w:hAnsi="Courier New" w:cs="Courier New"/>
+          <w:kern w:val="0"/>
+          <w:sz w:val="20"/>
+          <w:szCs w:val="20"/>
+          <w:lang w:eastAsia="en-IN"/>
+          <w14:ligatures w14:val="none"/>
+        </w:rPr>
+        <w:t xml:space="preserve">     </w:t>
       </w:r>
       <w:r>
         <w:rPr>
@@ -20146,16 +20484,29 @@
           <w14:ligatures w14:val="none"/>
         </w:rPr>
       </w:pPr>
-      <w:r>
-        <w:rPr>
-          <w:rFonts w:ascii="Courier New" w:eastAsia="Times New Roman" w:hAnsi="Courier New" w:cs="Courier New"/>
-          <w:kern w:val="0"/>
-          <w:sz w:val="20"/>
-          <w:szCs w:val="20"/>
-          <w:lang w:eastAsia="en-IN"/>
-          <w14:ligatures w14:val="none"/>
-        </w:rPr>
-        <w:t xml:space="preserve">05  confidence         </w:t>
+      <w:proofErr w:type="gramStart"/>
+      <w:r>
+        <w:rPr>
+          <w:rFonts w:ascii="Courier New" w:eastAsia="Times New Roman" w:hAnsi="Courier New" w:cs="Courier New"/>
+          <w:kern w:val="0"/>
+          <w:sz w:val="20"/>
+          <w:szCs w:val="20"/>
+          <w:lang w:eastAsia="en-IN"/>
+          <w14:ligatures w14:val="none"/>
+        </w:rPr>
+        <w:t>05  confidence</w:t>
+      </w:r>
+      <w:proofErr w:type="gramEnd"/>
+      <w:r>
+        <w:rPr>
+          <w:rFonts w:ascii="Courier New" w:eastAsia="Times New Roman" w:hAnsi="Courier New" w:cs="Courier New"/>
+          <w:kern w:val="0"/>
+          <w:sz w:val="20"/>
+          <w:szCs w:val="20"/>
+          <w:lang w:eastAsia="en-IN"/>
+          <w14:ligatures w14:val="none"/>
+        </w:rPr>
+        <w:t xml:space="preserve">         </w:t>
       </w:r>
       <w:r>
         <w:rPr>
@@ -20350,16 +20701,29 @@
           <w14:ligatures w14:val="none"/>
         </w:rPr>
       </w:pPr>
-      <w:r>
-        <w:rPr>
-          <w:rFonts w:ascii="Times New Roman" w:eastAsia="Times New Roman" w:hAnsi="Times New Roman" w:cs="Times New Roman"/>
-          <w:kern w:val="0"/>
-          <w:sz w:val="24"/>
-          <w:szCs w:val="24"/>
-          <w:lang w:eastAsia="en-IN"/>
-          <w14:ligatures w14:val="none"/>
-        </w:rPr>
-        <w:t>to test the matched audio.</w:t>
+      <w:proofErr w:type="gramStart"/>
+      <w:r>
+        <w:rPr>
+          <w:rFonts w:ascii="Times New Roman" w:eastAsia="Times New Roman" w:hAnsi="Times New Roman" w:cs="Times New Roman"/>
+          <w:kern w:val="0"/>
+          <w:sz w:val="24"/>
+          <w:szCs w:val="24"/>
+          <w:lang w:eastAsia="en-IN"/>
+          <w14:ligatures w14:val="none"/>
+        </w:rPr>
+        <w:t>to</w:t>
+      </w:r>
+      <w:proofErr w:type="gramEnd"/>
+      <w:r>
+        <w:rPr>
+          <w:rFonts w:ascii="Times New Roman" w:eastAsia="Times New Roman" w:hAnsi="Times New Roman" w:cs="Times New Roman"/>
+          <w:kern w:val="0"/>
+          <w:sz w:val="24"/>
+          <w:szCs w:val="24"/>
+          <w:lang w:eastAsia="en-IN"/>
+          <w14:ligatures w14:val="none"/>
+        </w:rPr>
+        <w:t xml:space="preserve"> test the matched audio.</w:t>
       </w:r>
     </w:p>
     <w:p>
@@ -20384,7 +20748,7 @@
           <w14:ligatures w14:val="none"/>
         </w:rPr>
         <w:pict>
-          <v:rect id="_x0000_i1082" style="width:0;height:1.5pt" o:hralign="center" o:hrstd="t" o:hr="t" fillcolor="#a0a0a0" stroked="f"/>
+          <v:rect id="_x0000_i1057" style="width:0;height:1.5pt" o:hralign="center" o:hrstd="t" o:hr="t" fillcolor="#a0a0a0" stroked="f"/>
         </w:pict>
       </w:r>
     </w:p>
@@ -20676,16 +21040,29 @@
           <w14:ligatures w14:val="none"/>
         </w:rPr>
       </w:pPr>
-      <w:r>
-        <w:rPr>
-          <w:rFonts w:ascii="Times New Roman" w:eastAsia="Times New Roman" w:hAnsi="Times New Roman" w:cs="Times New Roman"/>
-          <w:kern w:val="0"/>
-          <w:sz w:val="24"/>
-          <w:szCs w:val="24"/>
-          <w:lang w:eastAsia="en-IN"/>
-          <w14:ligatures w14:val="none"/>
-        </w:rPr>
-        <w:t>unless the teacher specifically provides different audio files.</w:t>
+      <w:proofErr w:type="gramStart"/>
+      <w:r>
+        <w:rPr>
+          <w:rFonts w:ascii="Times New Roman" w:eastAsia="Times New Roman" w:hAnsi="Times New Roman" w:cs="Times New Roman"/>
+          <w:kern w:val="0"/>
+          <w:sz w:val="24"/>
+          <w:szCs w:val="24"/>
+          <w:lang w:eastAsia="en-IN"/>
+          <w14:ligatures w14:val="none"/>
+        </w:rPr>
+        <w:t>unless</w:t>
+      </w:r>
+      <w:proofErr w:type="gramEnd"/>
+      <w:r>
+        <w:rPr>
+          <w:rFonts w:ascii="Times New Roman" w:eastAsia="Times New Roman" w:hAnsi="Times New Roman" w:cs="Times New Roman"/>
+          <w:kern w:val="0"/>
+          <w:sz w:val="24"/>
+          <w:szCs w:val="24"/>
+          <w:lang w:eastAsia="en-IN"/>
+          <w14:ligatures w14:val="none"/>
+        </w:rPr>
+        <w:t xml:space="preserve"> the teacher specifically provides different audio files.</w:t>
       </w:r>
     </w:p>
     <w:p>
@@ -20758,7 +21135,7 @@
           <w14:ligatures w14:val="none"/>
         </w:rPr>
         <w:pict>
-          <v:rect id="_x0000_i1083" style="width:0;height:1.5pt" o:hralign="center" o:hrstd="t" o:hr="t" fillcolor="#a0a0a0" stroked="f"/>
+          <v:rect id="_x0000_i1058" style="width:0;height:1.5pt" o:hralign="center" o:hrstd="t" o:hr="t" fillcolor="#a0a0a0" stroked="f"/>
         </w:pict>
       </w:r>
     </w:p>
@@ -21090,7 +21467,7 @@
           <w14:ligatures w14:val="none"/>
         </w:rPr>
         <w:pict>
-          <v:rect id="_x0000_i1084" style="width:0;height:1.5pt" o:hralign="center" o:hrstd="t" o:hr="t" fillcolor="#a0a0a0" stroked="f"/>
+          <v:rect id="_x0000_i1059" style="width:0;height:1.5pt" o:hralign="center" o:hrstd="t" o:hr="t" fillcolor="#a0a0a0" stroked="f"/>
         </w:pict>
       </w:r>
     </w:p>
@@ -21498,6 +21875,7 @@
           <w14:ligatures w14:val="none"/>
         </w:rPr>
       </w:pPr>
+      <w:proofErr w:type="gramStart"/>
       <w:r>
         <w:rPr>
           <w:rFonts w:ascii="Courier New" w:eastAsia="Times New Roman" w:hAnsi="Courier New" w:cs="Courier New"/>
@@ -21509,6 +21887,7 @@
         </w:rPr>
         <w:t>beautiful</w:t>
       </w:r>
+      <w:proofErr w:type="gramEnd"/>
     </w:p>
     <w:p>
       <w:pPr>
@@ -21816,6 +22195,7 @@
           <w14:ligatures w14:val="none"/>
         </w:rPr>
       </w:pPr>
+      <w:proofErr w:type="gramStart"/>
       <w:r>
         <w:rPr>
           <w:rFonts w:ascii="Courier New" w:eastAsia="Times New Roman" w:hAnsi="Courier New" w:cs="Courier New"/>
@@ -21827,6 +22207,7 @@
         </w:rPr>
         <w:t>beautiful</w:t>
       </w:r>
+      <w:proofErr w:type="gramEnd"/>
     </w:p>
     <w:p>
       <w:pPr>
@@ -21936,9 +22317,58 @@
         <w:t>The audio must always follow the word.</w:t>
       </w:r>
     </w:p>
-    <w:p>
+    <w:p/>
+    <w:p/>
+    <w:p/>
+    <w:p>
+      <w:proofErr w:type="spellStart"/>
+      <w:r>
+        <w:t>Github</w:t>
+      </w:r>
+      <w:proofErr w:type="spellEnd"/>
+      <w:r>
+        <w:t xml:space="preserve"> – push to update </w:t>
+      </w:r>
+      <w:r>
+        <w:br/>
+      </w:r>
+    </w:p>
+    <w:p>
+      <w:r>
+        <w:t>Run in power cell</w:t>
+      </w:r>
       <w:bookmarkStart w:id="0" w:name="_GoBack"/>
       <w:bookmarkEnd w:id="0"/>
+    </w:p>
+    <w:p>
+      <w:proofErr w:type="spellStart"/>
+      <w:proofErr w:type="gramStart"/>
+      <w:r>
+        <w:t>gh</w:t>
+      </w:r>
+      <w:proofErr w:type="spellEnd"/>
+      <w:proofErr w:type="gramEnd"/>
+      <w:r>
+        <w:t xml:space="preserve"> </w:t>
+      </w:r>
+      <w:proofErr w:type="spellStart"/>
+      <w:r>
+        <w:t>auth</w:t>
+      </w:r>
+      <w:proofErr w:type="spellEnd"/>
+      <w:r>
+        <w:t xml:space="preserve"> login</w:t>
+      </w:r>
+    </w:p>
+    <w:p>
+      <w:proofErr w:type="gramStart"/>
+      <w:r>
+        <w:t>git</w:t>
+      </w:r>
+      <w:proofErr w:type="gramEnd"/>
+      <w:r>
+        <w:t xml:space="preserve"> push origin main</w:t>
+      </w:r>
     </w:p>
     <w:sectPr>
       <w:pgSz w:w="11906" w:h="16838"/>

</xml_diff>